<commit_message>
Restyle Lab 1 deliverables with formal minimal layout
</commit_message>
<xml_diff>
--- a/Lab1/Lab1_Requirements_Table.docx
+++ b/Lab1/Lab1_Requirements_Table.docx
@@ -2,21 +2,6 @@
 <file path=word/document.xml><?xml version="1.0" encoding="utf-8"?>
 <w:document xmlns:wpc="http://schemas.microsoft.com/office/word/2010/wordprocessingCanvas" xmlns:mo="http://schemas.microsoft.com/office/mac/office/2008/main" xmlns:mc="http://schemas.openxmlformats.org/markup-compatibility/2006" xmlns:mv="urn:schemas-microsoft-com:mac:vml" xmlns:o="urn:schemas-microsoft-com:office:office" xmlns:r="http://schemas.openxmlformats.org/officeDocument/2006/relationships" xmlns:m="http://schemas.openxmlformats.org/officeDocument/2006/math" xmlns:v="urn:schemas-microsoft-com:vml" xmlns:wp14="http://schemas.microsoft.com/office/word/2010/wordprocessingDrawing" xmlns:wp="http://schemas.openxmlformats.org/drawingml/2006/wordprocessingDrawing" xmlns:w10="urn:schemas-microsoft-com:office:word" xmlns:w="http://schemas.openxmlformats.org/wordprocessingml/2006/main" xmlns:w14="http://schemas.microsoft.com/office/word/2010/wordml" xmlns:wpg="http://schemas.microsoft.com/office/word/2010/wordprocessingGroup" xmlns:wpi="http://schemas.microsoft.com/office/word/2010/wordprocessingInk" xmlns:wne="http://schemas.microsoft.com/office/word/2006/wordml" xmlns:wps="http://schemas.microsoft.com/office/word/2010/wordprocessingShape" mc:Ignorable="w14 wp14">
   <w:body>
-    <w:p>
-      <w:pPr>
-        <w:spacing w:before="0" w:after="60" w:line="240" w:lineRule="auto"/>
-      </w:pPr>
-      <w:r>
-        <w:rPr>
-          <w:rFonts w:ascii="Arial" w:hAnsi="Arial"/>
-          <w:b/>
-          <w:i w:val="0"/>
-          <w:color w:val="2F66D0"/>
-          <w:sz w:val="17"/>
-        </w:rPr>
-        <w:t>SOFTWARE ENGINEERING | LAB 1 | PROBLEM STATEMENT 30</w:t>
-      </w:r>
-    </w:p>
     <w:p>
       <w:pPr>
         <w:spacing w:before="0" w:after="40" w:line="240" w:lineRule="auto"/>
@@ -26,91 +11,242 @@
           <w:rFonts w:ascii="Arial" w:hAnsi="Arial"/>
           <w:b/>
           <w:i w:val="0"/>
-          <w:color w:val="17365D"/>
-          <w:sz w:val="40"/>
+          <w:color w:val="000000"/>
+          <w:sz w:val="36"/>
         </w:rPr>
         <w:t>Requirements Table</w:t>
       </w:r>
     </w:p>
     <w:p>
       <w:pPr>
-        <w:spacing w:before="0" w:after="120" w:line="240" w:lineRule="auto"/>
+        <w:spacing w:before="0" w:after="100" w:line="240" w:lineRule="auto"/>
       </w:pPr>
       <w:r>
         <w:rPr>
           <w:rFonts w:ascii="Arial" w:hAnsi="Arial"/>
           <w:b w:val="0"/>
           <w:i w:val="0"/>
-          <w:color w:val="5B6573"/>
+          <w:color w:val="000000"/>
           <w:sz w:val="21"/>
         </w:rPr>
         <w:t>Airport Lost Luggage Claim &amp; Tracking Portal</w:t>
       </w:r>
     </w:p>
+    <w:tbl>
+      <w:tblPr>
+        <w:tblStyle w:val="TableGrid"/>
+        <w:tblW w:type="dxa" w:w="9600"/>
+        <w:tblLayout w:type="fixed"/>
+        <w:tblLook w:firstColumn="1" w:firstRow="1" w:lastColumn="0" w:lastRow="0" w:noHBand="0" w:noVBand="1" w:val="04A0"/>
+        <w:jc w:val="center"/>
+        <w:tblInd w:w="0" w:type="dxa"/>
+      </w:tblPr>
+      <w:tblGrid>
+        <w:gridCol w:w="900"/>
+        <w:gridCol w:w="3600"/>
+        <w:gridCol w:w="800"/>
+        <w:gridCol w:w="2800"/>
+        <w:gridCol w:w="800"/>
+        <w:gridCol w:w="700"/>
+      </w:tblGrid>
+      <w:tr>
+        <w:trPr>
+          <w:tblHeader w:val="true"/>
+        </w:trPr>
+        <w:tc>
+          <w:tcPr>
+            <w:tcW w:type="dxa" w:w="900"/>
+            <w:vAlign w:val="center"/>
+            <w:shd w:fill="EDEDED"/>
+            <w:tcMar>
+              <w:top w:w="60" w:type="dxa"/>
+              <w:start w:w="100" w:type="dxa"/>
+              <w:bottom w:w="60" w:type="dxa"/>
+              <w:end w:w="100" w:type="dxa"/>
+            </w:tcMar>
+          </w:tcPr>
+          <w:p>
+            <w:pPr>
+              <w:spacing w:before="0" w:after="0" w:line="240" w:lineRule="auto"/>
+            </w:pPr>
+            <w:r>
+              <w:rPr>
+                <w:rFonts w:ascii="Arial" w:hAnsi="Arial"/>
+                <w:b/>
+                <w:i w:val="0"/>
+                <w:color w:val="000000"/>
+                <w:sz w:val="16"/>
+              </w:rPr>
+              <w:t>Name</w:t>
+            </w:r>
+          </w:p>
+        </w:tc>
+        <w:tc>
+          <w:tcPr>
+            <w:tcW w:type="dxa" w:w="3600"/>
+            <w:vAlign w:val="center"/>
+            <w:shd w:fill="FFFFFF"/>
+            <w:tcMar>
+              <w:top w:w="60" w:type="dxa"/>
+              <w:start w:w="100" w:type="dxa"/>
+              <w:bottom w:w="60" w:type="dxa"/>
+              <w:end w:w="100" w:type="dxa"/>
+            </w:tcMar>
+          </w:tcPr>
+          <w:p>
+            <w:pPr>
+              <w:spacing w:before="0" w:after="0" w:line="240" w:lineRule="auto"/>
+            </w:pPr>
+            <w:r>
+              <w:rPr>
+                <w:rFonts w:ascii="Arial" w:hAnsi="Arial"/>
+                <w:b w:val="0"/>
+                <w:i w:val="0"/>
+                <w:color w:val="000000"/>
+                <w:sz w:val="16"/>
+              </w:rPr>
+              <w:t>Mohammed Zahoor Mashahir</w:t>
+            </w:r>
+          </w:p>
+        </w:tc>
+        <w:tc>
+          <w:tcPr>
+            <w:tcW w:type="dxa" w:w="800"/>
+            <w:vAlign w:val="center"/>
+            <w:shd w:fill="EDEDED"/>
+            <w:tcMar>
+              <w:top w:w="60" w:type="dxa"/>
+              <w:start w:w="100" w:type="dxa"/>
+              <w:bottom w:w="60" w:type="dxa"/>
+              <w:end w:w="100" w:type="dxa"/>
+            </w:tcMar>
+          </w:tcPr>
+          <w:p>
+            <w:pPr>
+              <w:spacing w:before="0" w:after="0" w:line="240" w:lineRule="auto"/>
+            </w:pPr>
+            <w:r>
+              <w:rPr>
+                <w:rFonts w:ascii="Arial" w:hAnsi="Arial"/>
+                <w:b/>
+                <w:i w:val="0"/>
+                <w:color w:val="000000"/>
+                <w:sz w:val="16"/>
+              </w:rPr>
+              <w:t>SRN</w:t>
+            </w:r>
+          </w:p>
+        </w:tc>
+        <w:tc>
+          <w:tcPr>
+            <w:tcW w:type="dxa" w:w="2800"/>
+            <w:vAlign w:val="center"/>
+            <w:shd w:fill="FFFFFF"/>
+            <w:tcMar>
+              <w:top w:w="60" w:type="dxa"/>
+              <w:start w:w="100" w:type="dxa"/>
+              <w:bottom w:w="60" w:type="dxa"/>
+              <w:end w:w="100" w:type="dxa"/>
+            </w:tcMar>
+          </w:tcPr>
+          <w:p>
+            <w:pPr>
+              <w:spacing w:before="0" w:after="0" w:line="240" w:lineRule="auto"/>
+            </w:pPr>
+            <w:r>
+              <w:rPr>
+                <w:rFonts w:ascii="Arial" w:hAnsi="Arial"/>
+                <w:b w:val="0"/>
+                <w:i w:val="0"/>
+                <w:color w:val="000000"/>
+                <w:sz w:val="16"/>
+              </w:rPr>
+              <w:t>PES1UG24CS579</w:t>
+            </w:r>
+          </w:p>
+        </w:tc>
+        <w:tc>
+          <w:tcPr>
+            <w:tcW w:type="dxa" w:w="800"/>
+            <w:vAlign w:val="center"/>
+            <w:shd w:fill="EDEDED"/>
+            <w:tcMar>
+              <w:top w:w="60" w:type="dxa"/>
+              <w:start w:w="100" w:type="dxa"/>
+              <w:bottom w:w="60" w:type="dxa"/>
+              <w:end w:w="100" w:type="dxa"/>
+            </w:tcMar>
+          </w:tcPr>
+          <w:p>
+            <w:pPr>
+              <w:spacing w:before="0" w:after="0" w:line="240" w:lineRule="auto"/>
+            </w:pPr>
+            <w:r>
+              <w:rPr>
+                <w:rFonts w:ascii="Arial" w:hAnsi="Arial"/>
+                <w:b/>
+                <w:i w:val="0"/>
+                <w:color w:val="000000"/>
+                <w:sz w:val="16"/>
+              </w:rPr>
+              <w:t>Section</w:t>
+            </w:r>
+          </w:p>
+        </w:tc>
+        <w:tc>
+          <w:tcPr>
+            <w:tcW w:type="dxa" w:w="700"/>
+            <w:vAlign w:val="center"/>
+            <w:shd w:fill="FFFFFF"/>
+            <w:tcMar>
+              <w:top w:w="60" w:type="dxa"/>
+              <w:start w:w="100" w:type="dxa"/>
+              <w:bottom w:w="60" w:type="dxa"/>
+              <w:end w:w="100" w:type="dxa"/>
+            </w:tcMar>
+          </w:tcPr>
+          <w:p>
+            <w:pPr>
+              <w:spacing w:before="0" w:after="0" w:line="240" w:lineRule="auto"/>
+            </w:pPr>
+            <w:r>
+              <w:rPr>
+                <w:rFonts w:ascii="Arial" w:hAnsi="Arial"/>
+                <w:b w:val="0"/>
+                <w:i w:val="0"/>
+                <w:color w:val="000000"/>
+                <w:sz w:val="16"/>
+              </w:rPr>
+              <w:t>J</w:t>
+            </w:r>
+          </w:p>
+        </w:tc>
+      </w:tr>
+    </w:tbl>
     <w:p>
       <w:pPr>
-        <w:spacing w:after="160"/>
+        <w:pBdr>
+          <w:bottom w:val="single" w:sz="4" w:space="3" w:color="777777"/>
+        </w:pBdr>
+        <w:spacing w:before="20" w:after="100"/>
       </w:pPr>
-      <w:r>
-        <w:rPr>
-          <w:rFonts w:ascii="Arial" w:hAnsi="Arial"/>
-          <w:b/>
-          <w:i w:val="0"/>
-          <w:color w:val="182230"/>
-          <w:sz w:val="17"/>
-        </w:rPr>
-        <w:t xml:space="preserve">SRN: </w:t>
-      </w:r>
-      <w:r>
-        <w:rPr>
-          <w:rFonts w:ascii="Arial" w:hAnsi="Arial"/>
-          <w:b w:val="0"/>
-          <w:i w:val="0"/>
-          <w:color w:val="182230"/>
-          <w:sz w:val="17"/>
-        </w:rPr>
-        <w:t>PES1UG24CS579</w:t>
-      </w:r>
-      <w:r>
-        <w:t xml:space="preserve">   |   </w:t>
-      </w:r>
-      <w:r>
-        <w:rPr>
-          <w:rFonts w:ascii="Arial" w:hAnsi="Arial"/>
-          <w:b/>
-          <w:i w:val="0"/>
-          <w:color w:val="182230"/>
-          <w:sz w:val="17"/>
-        </w:rPr>
-        <w:t xml:space="preserve">Domain: </w:t>
-      </w:r>
-      <w:r>
-        <w:rPr>
-          <w:rFonts w:ascii="Arial" w:hAnsi="Arial"/>
-          <w:b w:val="0"/>
-          <w:i w:val="0"/>
-          <w:color w:val="182230"/>
-          <w:sz w:val="17"/>
-        </w:rPr>
-        <w:t>Smart Cities, Transport &amp; Logistics</w:t>
-      </w:r>
     </w:p>
     <w:tbl>
       <w:tblPr>
         <w:tblStyle w:val="TableGrid"/>
-        <w:tblW w:type="dxa" w:w="14400"/>
+        <w:tblW w:type="dxa" w:w="15120"/>
         <w:tblLayout w:type="fixed"/>
         <w:tblLook w:firstColumn="1" w:firstRow="1" w:lastColumn="0" w:lastRow="0" w:noHBand="0" w:noVBand="1" w:val="04A0"/>
         <w:jc w:val="left"/>
-        <w:tblInd w:w="120" w:type="dxa"/>
+        <w:tblInd w:w="0" w:type="dxa"/>
       </w:tblPr>
       <w:tblGrid>
-        <w:gridCol w:w="1000"/>
-        <w:gridCol w:w="1550"/>
-        <w:gridCol w:w="3000"/>
-        <w:gridCol w:w="800"/>
-        <w:gridCol w:w="4550"/>
-        <w:gridCol w:w="3500"/>
+        <w:gridCol w:w="1050"/>
+        <w:gridCol w:w="1600"/>
+        <w:gridCol w:w="3150"/>
+        <w:gridCol w:w="850"/>
+        <w:gridCol w:w="4800"/>
+        <w:gridCol w:w="3670"/>
       </w:tblGrid>
       <w:tr>
         <w:trPr>
@@ -119,7 +255,7 @@
         </w:trPr>
         <w:tc>
           <w:tcPr>
-            <w:tcW w:type="dxa" w:w="1000"/>
+            <w:tcW w:type="dxa" w:w="1050"/>
             <w:tcMar>
               <w:top w:w="50" w:type="dxa"/>
               <w:start w:w="120" w:type="dxa"/>
@@ -127,7 +263,7 @@
               <w:end w:w="120" w:type="dxa"/>
             </w:tcMar>
             <w:vAlign w:val="center"/>
-            <w:shd w:fill="17365D"/>
+            <w:shd w:fill="EDEDED"/>
           </w:tcPr>
           <w:p>
             <w:pPr>
@@ -139,7 +275,7 @@
                 <w:rFonts w:ascii="Arial" w:hAnsi="Arial"/>
                 <w:b/>
                 <w:i w:val="0"/>
-                <w:color w:val="FFFFFF"/>
+                <w:color w:val="000000"/>
                 <w:sz w:val="16"/>
               </w:rPr>
               <w:t>Req ID</w:t>
@@ -148,7 +284,7 @@
         </w:tc>
         <w:tc>
           <w:tcPr>
-            <w:tcW w:type="dxa" w:w="1550"/>
+            <w:tcW w:type="dxa" w:w="1600"/>
             <w:tcMar>
               <w:top w:w="50" w:type="dxa"/>
               <w:start w:w="120" w:type="dxa"/>
@@ -156,7 +292,7 @@
               <w:end w:w="120" w:type="dxa"/>
             </w:tcMar>
             <w:vAlign w:val="center"/>
-            <w:shd w:fill="17365D"/>
+            <w:shd w:fill="EDEDED"/>
           </w:tcPr>
           <w:p>
             <w:pPr>
@@ -168,7 +304,7 @@
                 <w:rFonts w:ascii="Arial" w:hAnsi="Arial"/>
                 <w:b/>
                 <w:i w:val="0"/>
-                <w:color w:val="FFFFFF"/>
+                <w:color w:val="000000"/>
                 <w:sz w:val="16"/>
               </w:rPr>
               <w:t>Type</w:t>
@@ -177,7 +313,7 @@
         </w:tc>
         <w:tc>
           <w:tcPr>
-            <w:tcW w:type="dxa" w:w="3000"/>
+            <w:tcW w:type="dxa" w:w="3150"/>
             <w:tcMar>
               <w:top w:w="50" w:type="dxa"/>
               <w:start w:w="120" w:type="dxa"/>
@@ -185,7 +321,7 @@
               <w:end w:w="120" w:type="dxa"/>
             </w:tcMar>
             <w:vAlign w:val="center"/>
-            <w:shd w:fill="17365D"/>
+            <w:shd w:fill="EDEDED"/>
           </w:tcPr>
           <w:p>
             <w:pPr>
@@ -197,7 +333,7 @@
                 <w:rFonts w:ascii="Arial" w:hAnsi="Arial"/>
                 <w:b/>
                 <w:i w:val="0"/>
-                <w:color w:val="FFFFFF"/>
+                <w:color w:val="000000"/>
                 <w:sz w:val="16"/>
               </w:rPr>
               <w:t>Description</w:t>
@@ -206,7 +342,7 @@
         </w:tc>
         <w:tc>
           <w:tcPr>
-            <w:tcW w:type="dxa" w:w="800"/>
+            <w:tcW w:type="dxa" w:w="850"/>
             <w:tcMar>
               <w:top w:w="50" w:type="dxa"/>
               <w:start w:w="120" w:type="dxa"/>
@@ -214,7 +350,7 @@
               <w:end w:w="120" w:type="dxa"/>
             </w:tcMar>
             <w:vAlign w:val="center"/>
-            <w:shd w:fill="17365D"/>
+            <w:shd w:fill="EDEDED"/>
           </w:tcPr>
           <w:p>
             <w:pPr>
@@ -226,7 +362,7 @@
                 <w:rFonts w:ascii="Arial" w:hAnsi="Arial"/>
                 <w:b/>
                 <w:i w:val="0"/>
-                <w:color w:val="FFFFFF"/>
+                <w:color w:val="000000"/>
                 <w:sz w:val="16"/>
               </w:rPr>
               <w:t>Priority</w:t>
@@ -235,7 +371,7 @@
         </w:tc>
         <w:tc>
           <w:tcPr>
-            <w:tcW w:type="dxa" w:w="4550"/>
+            <w:tcW w:type="dxa" w:w="4800"/>
             <w:tcMar>
               <w:top w:w="50" w:type="dxa"/>
               <w:start w:w="120" w:type="dxa"/>
@@ -243,7 +379,7 @@
               <w:end w:w="120" w:type="dxa"/>
             </w:tcMar>
             <w:vAlign w:val="center"/>
-            <w:shd w:fill="17365D"/>
+            <w:shd w:fill="EDEDED"/>
           </w:tcPr>
           <w:p>
             <w:pPr>
@@ -255,7 +391,7 @@
                 <w:rFonts w:ascii="Arial" w:hAnsi="Arial"/>
                 <w:b/>
                 <w:i w:val="0"/>
-                <w:color w:val="FFFFFF"/>
+                <w:color w:val="000000"/>
                 <w:sz w:val="16"/>
               </w:rPr>
               <w:t>Acceptance Criteria</w:t>
@@ -264,7 +400,7 @@
         </w:tc>
         <w:tc>
           <w:tcPr>
-            <w:tcW w:type="dxa" w:w="3500"/>
+            <w:tcW w:type="dxa" w:w="3670"/>
             <w:tcMar>
               <w:top w:w="50" w:type="dxa"/>
               <w:start w:w="120" w:type="dxa"/>
@@ -272,7 +408,7 @@
               <w:end w:w="120" w:type="dxa"/>
             </w:tcMar>
             <w:vAlign w:val="center"/>
-            <w:shd w:fill="17365D"/>
+            <w:shd w:fill="EDEDED"/>
           </w:tcPr>
           <w:p>
             <w:pPr>
@@ -284,7 +420,7 @@
                 <w:rFonts w:ascii="Arial" w:hAnsi="Arial"/>
                 <w:b/>
                 <w:i w:val="0"/>
-                <w:color w:val="FFFFFF"/>
+                <w:color w:val="000000"/>
                 <w:sz w:val="16"/>
               </w:rPr>
               <w:t>Rationale</w:t>
@@ -298,186 +434,7 @@
         </w:trPr>
         <w:tc>
           <w:tcPr>
-            <w:tcW w:type="dxa" w:w="1000"/>
-            <w:vAlign w:val="center"/>
-            <w:shd w:fill="EAF2FF"/>
-            <w:tcMar>
-              <w:top w:w="50" w:type="dxa"/>
-              <w:start w:w="120" w:type="dxa"/>
-              <w:bottom w:w="50" w:type="dxa"/>
-              <w:end w:w="120" w:type="dxa"/>
-            </w:tcMar>
-          </w:tcPr>
-          <w:p>
-            <w:pPr>
-              <w:spacing w:before="0" w:after="0" w:line="240" w:lineRule="auto"/>
-              <w:jc w:val="center"/>
-            </w:pPr>
-            <w:r>
-              <w:rPr>
-                <w:rFonts w:ascii="Arial" w:hAnsi="Arial"/>
-                <w:b/>
-                <w:i w:val="0"/>
-                <w:color w:val="17365D"/>
-                <w:sz w:val="15"/>
-              </w:rPr>
-              <w:t>FR-001</w:t>
-            </w:r>
-          </w:p>
-        </w:tc>
-        <w:tc>
-          <w:tcPr>
-            <w:tcW w:type="dxa" w:w="1550"/>
-            <w:vAlign w:val="center"/>
-            <w:shd w:fill="EAF2FF"/>
-            <w:tcMar>
-              <w:top w:w="50" w:type="dxa"/>
-              <w:start w:w="120" w:type="dxa"/>
-              <w:bottom w:w="50" w:type="dxa"/>
-              <w:end w:w="120" w:type="dxa"/>
-            </w:tcMar>
-          </w:tcPr>
-          <w:p>
-            <w:pPr>
-              <w:spacing w:before="0" w:after="0" w:line="240" w:lineRule="auto"/>
-              <w:jc w:val="center"/>
-            </w:pPr>
-            <w:r>
-              <w:rPr>
-                <w:rFonts w:ascii="Arial" w:hAnsi="Arial"/>
-                <w:b w:val="0"/>
-                <w:i w:val="0"/>
-                <w:color w:val="182230"/>
-                <w:sz w:val="15"/>
-              </w:rPr>
-              <w:t>Functional</w:t>
-            </w:r>
-          </w:p>
-        </w:tc>
-        <w:tc>
-          <w:tcPr>
-            <w:tcW w:type="dxa" w:w="3000"/>
-            <w:vAlign w:val="center"/>
-            <w:shd w:fill="EAF2FF"/>
-            <w:tcMar>
-              <w:top w:w="50" w:type="dxa"/>
-              <w:start w:w="120" w:type="dxa"/>
-              <w:bottom w:w="50" w:type="dxa"/>
-              <w:end w:w="120" w:type="dxa"/>
-            </w:tcMar>
-          </w:tcPr>
-          <w:p>
-            <w:pPr>
-              <w:spacing w:before="0" w:after="0" w:line="240" w:lineRule="auto"/>
-              <w:jc w:val="left"/>
-            </w:pPr>
-            <w:r>
-              <w:rPr>
-                <w:rFonts w:ascii="Arial" w:hAnsi="Arial"/>
-                <w:b w:val="0"/>
-                <w:i w:val="0"/>
-                <w:color w:val="182230"/>
-                <w:sz w:val="15"/>
-              </w:rPr>
-              <w:t>The system shall cross-reference a passenger's lost-baggage report with unrouted baggage scan logs from all connected airport terminals using the submitted bag-tag number and itinerary.</w:t>
-            </w:r>
-          </w:p>
-        </w:tc>
-        <w:tc>
-          <w:tcPr>
-            <w:tcW w:type="dxa" w:w="800"/>
-            <w:vAlign w:val="center"/>
-            <w:shd w:fill="EAF2FF"/>
-            <w:tcMar>
-              <w:top w:w="50" w:type="dxa"/>
-              <w:start w:w="120" w:type="dxa"/>
-              <w:bottom w:w="50" w:type="dxa"/>
-              <w:end w:w="120" w:type="dxa"/>
-            </w:tcMar>
-          </w:tcPr>
-          <w:p>
-            <w:pPr>
-              <w:spacing w:before="0" w:after="0" w:line="240" w:lineRule="auto"/>
-              <w:jc w:val="center"/>
-            </w:pPr>
-            <w:r>
-              <w:rPr>
-                <w:rFonts w:ascii="Arial" w:hAnsi="Arial"/>
-                <w:b w:val="0"/>
-                <w:i w:val="0"/>
-                <w:color w:val="182230"/>
-                <w:sz w:val="15"/>
-              </w:rPr>
-              <w:t>High</w:t>
-            </w:r>
-          </w:p>
-        </w:tc>
-        <w:tc>
-          <w:tcPr>
-            <w:tcW w:type="dxa" w:w="4550"/>
-            <w:vAlign w:val="center"/>
-            <w:shd w:fill="EAF2FF"/>
-            <w:tcMar>
-              <w:top w:w="50" w:type="dxa"/>
-              <w:start w:w="120" w:type="dxa"/>
-              <w:bottom w:w="50" w:type="dxa"/>
-              <w:end w:w="120" w:type="dxa"/>
-            </w:tcMar>
-          </w:tcPr>
-          <w:p>
-            <w:pPr>
-              <w:spacing w:before="0" w:after="0" w:line="240" w:lineRule="auto"/>
-              <w:jc w:val="left"/>
-            </w:pPr>
-            <w:r>
-              <w:rPr>
-                <w:rFonts w:ascii="Arial" w:hAnsi="Arial"/>
-                <w:b w:val="0"/>
-                <w:i w:val="0"/>
-                <w:color w:val="182230"/>
-                <w:sz w:val="15"/>
-              </w:rPr>
-              <w:t>PASS: Given a valid report and a seeded matching unrouted scan, the correct scan timeline is linked to the claim and a recovery alert is generated within 5 seconds. FAIL: An invalid-format bag tag is accepted, a different bag is linked, or no alert is generated for the seeded match.</w:t>
-            </w:r>
-          </w:p>
-        </w:tc>
-        <w:tc>
-          <w:tcPr>
-            <w:tcW w:type="dxa" w:w="3500"/>
-            <w:vAlign w:val="center"/>
-            <w:shd w:fill="EAF2FF"/>
-            <w:tcMar>
-              <w:top w:w="50" w:type="dxa"/>
-              <w:start w:w="120" w:type="dxa"/>
-              <w:bottom w:w="50" w:type="dxa"/>
-              <w:end w:w="120" w:type="dxa"/>
-            </w:tcMar>
-          </w:tcPr>
-          <w:p>
-            <w:pPr>
-              <w:spacing w:before="0" w:after="0" w:line="240" w:lineRule="auto"/>
-              <w:jc w:val="left"/>
-            </w:pPr>
-            <w:r>
-              <w:rPr>
-                <w:rFonts w:ascii="Arial" w:hAnsi="Arial"/>
-                <w:b w:val="0"/>
-                <w:i w:val="0"/>
-                <w:color w:val="182230"/>
-                <w:sz w:val="15"/>
-              </w:rPr>
-              <w:t>Directly supports the core recovery objective and preserves the supplied FR-001 intent.</w:t>
-            </w:r>
-          </w:p>
-        </w:tc>
-      </w:tr>
-      <w:tr>
-        <w:trPr>
-          <w:cantSplit/>
-        </w:trPr>
-        <w:tc>
-          <w:tcPr>
-            <w:tcW w:type="dxa" w:w="1000"/>
+            <w:tcW w:type="dxa" w:w="1050"/>
             <w:vAlign w:val="center"/>
             <w:shd w:fill="FFFFFF"/>
             <w:tcMar>
@@ -497,16 +454,16 @@
                 <w:rFonts w:ascii="Arial" w:hAnsi="Arial"/>
                 <w:b/>
                 <w:i w:val="0"/>
-                <w:color w:val="17365D"/>
-                <w:sz w:val="15"/>
+                <w:color w:val="000000"/>
+                <w:sz w:val="16"/>
               </w:rPr>
-              <w:t>FR-002</w:t>
+              <w:t>FR-001</w:t>
             </w:r>
           </w:p>
         </w:tc>
         <w:tc>
           <w:tcPr>
-            <w:tcW w:type="dxa" w:w="1550"/>
+            <w:tcW w:type="dxa" w:w="1600"/>
             <w:vAlign w:val="center"/>
             <w:shd w:fill="FFFFFF"/>
             <w:tcMar>
@@ -526,8 +483,8 @@
                 <w:rFonts w:ascii="Arial" w:hAnsi="Arial"/>
                 <w:b w:val="0"/>
                 <w:i w:val="0"/>
-                <w:color w:val="182230"/>
-                <w:sz w:val="15"/>
+                <w:color w:val="000000"/>
+                <w:sz w:val="16"/>
               </w:rPr>
               <w:t>Functional</w:t>
             </w:r>
@@ -535,7 +492,7 @@
         </w:tc>
         <w:tc>
           <w:tcPr>
-            <w:tcW w:type="dxa" w:w="3000"/>
+            <w:tcW w:type="dxa" w:w="3150"/>
             <w:vAlign w:val="center"/>
             <w:shd w:fill="FFFFFF"/>
             <w:tcMar>
@@ -555,16 +512,16 @@
                 <w:rFonts w:ascii="Arial" w:hAnsi="Arial"/>
                 <w:b w:val="0"/>
                 <w:i w:val="0"/>
-                <w:color w:val="182230"/>
-                <w:sz w:val="15"/>
+                <w:color w:val="000000"/>
+                <w:sz w:val="16"/>
               </w:rPr>
-              <w:t>The system shall allow a passenger to submit a lost-luggage claim containing booking reference, bag-tag number, itinerary, contact details, bag description, delivery address, and optional supporting images.</w:t>
+              <w:t>The system shall cross-reference a passenger's lost-baggage report with unrouted baggage scan logs from all connected airport terminals using the submitted bag-tag number and itinerary.</w:t>
             </w:r>
           </w:p>
         </w:tc>
         <w:tc>
           <w:tcPr>
-            <w:tcW w:type="dxa" w:w="800"/>
+            <w:tcW w:type="dxa" w:w="850"/>
             <w:vAlign w:val="center"/>
             <w:shd w:fill="FFFFFF"/>
             <w:tcMar>
@@ -584,8 +541,8 @@
                 <w:rFonts w:ascii="Arial" w:hAnsi="Arial"/>
                 <w:b w:val="0"/>
                 <w:i w:val="0"/>
-                <w:color w:val="182230"/>
-                <w:sz w:val="15"/>
+                <w:color w:val="000000"/>
+                <w:sz w:val="16"/>
               </w:rPr>
               <w:t>High</w:t>
             </w:r>
@@ -593,7 +550,7 @@
         </w:tc>
         <w:tc>
           <w:tcPr>
-            <w:tcW w:type="dxa" w:w="4550"/>
+            <w:tcW w:type="dxa" w:w="4800"/>
             <w:vAlign w:val="center"/>
             <w:shd w:fill="FFFFFF"/>
             <w:tcMar>
@@ -613,16 +570,16 @@
                 <w:rFonts w:ascii="Arial" w:hAnsi="Arial"/>
                 <w:b w:val="0"/>
                 <w:i w:val="0"/>
-                <w:color w:val="182230"/>
-                <w:sz w:val="15"/>
+                <w:color w:val="000000"/>
+                <w:sz w:val="16"/>
               </w:rPr>
-              <w:t>PASS: With all mandatory valid fields, one claim with a unique claim ID is stored and a confirmation is displayed within 3 seconds. FAIL: A claim is created with a missing mandatory field, a duplicate claim is created for the same active passenger/bag pair, or no claim ID is returned.</w:t>
+              <w:t>PASS: Given a valid report and a seeded matching unrouted scan, the correct scan timeline is linked to the claim and a recovery alert is generated within 5 seconds. FAIL: An invalid-format bag tag is accepted, a different bag is linked, or no alert is generated for the seeded match.</w:t>
             </w:r>
           </w:p>
         </w:tc>
         <w:tc>
           <w:tcPr>
-            <w:tcW w:type="dxa" w:w="3500"/>
+            <w:tcW w:type="dxa" w:w="3670"/>
             <w:vAlign w:val="center"/>
             <w:shd w:fill="FFFFFF"/>
             <w:tcMar>
@@ -642,10 +599,10 @@
                 <w:rFonts w:ascii="Arial" w:hAnsi="Arial"/>
                 <w:b w:val="0"/>
                 <w:i w:val="0"/>
-                <w:color w:val="182230"/>
-                <w:sz w:val="15"/>
+                <w:color w:val="000000"/>
+                <w:sz w:val="16"/>
               </w:rPr>
-              <w:t>Creates the authoritative case record needed for investigation, tracking, and passenger communication.</w:t>
+              <w:t>Directly supports the core recovery objective and preserves the supplied FR-001 intent.</w:t>
             </w:r>
           </w:p>
         </w:tc>
@@ -656,186 +613,7 @@
         </w:trPr>
         <w:tc>
           <w:tcPr>
-            <w:tcW w:type="dxa" w:w="1000"/>
-            <w:vAlign w:val="center"/>
-            <w:shd w:fill="EAF2FF"/>
-            <w:tcMar>
-              <w:top w:w="50" w:type="dxa"/>
-              <w:start w:w="120" w:type="dxa"/>
-              <w:bottom w:w="50" w:type="dxa"/>
-              <w:end w:w="120" w:type="dxa"/>
-            </w:tcMar>
-          </w:tcPr>
-          <w:p>
-            <w:pPr>
-              <w:spacing w:before="0" w:after="0" w:line="240" w:lineRule="auto"/>
-              <w:jc w:val="center"/>
-            </w:pPr>
-            <w:r>
-              <w:rPr>
-                <w:rFonts w:ascii="Arial" w:hAnsi="Arial"/>
-                <w:b/>
-                <w:i w:val="0"/>
-                <w:color w:val="17365D"/>
-                <w:sz w:val="15"/>
-              </w:rPr>
-              <w:t>FR-003</w:t>
-            </w:r>
-          </w:p>
-        </w:tc>
-        <w:tc>
-          <w:tcPr>
-            <w:tcW w:type="dxa" w:w="1550"/>
-            <w:vAlign w:val="center"/>
-            <w:shd w:fill="EAF2FF"/>
-            <w:tcMar>
-              <w:top w:w="50" w:type="dxa"/>
-              <w:start w:w="120" w:type="dxa"/>
-              <w:bottom w:w="50" w:type="dxa"/>
-              <w:end w:w="120" w:type="dxa"/>
-            </w:tcMar>
-          </w:tcPr>
-          <w:p>
-            <w:pPr>
-              <w:spacing w:before="0" w:after="0" w:line="240" w:lineRule="auto"/>
-              <w:jc w:val="center"/>
-            </w:pPr>
-            <w:r>
-              <w:rPr>
-                <w:rFonts w:ascii="Arial" w:hAnsi="Arial"/>
-                <w:b w:val="0"/>
-                <w:i w:val="0"/>
-                <w:color w:val="182230"/>
-                <w:sz w:val="15"/>
-              </w:rPr>
-              <w:t>Functional</w:t>
-            </w:r>
-          </w:p>
-        </w:tc>
-        <w:tc>
-          <w:tcPr>
-            <w:tcW w:type="dxa" w:w="3000"/>
-            <w:vAlign w:val="center"/>
-            <w:shd w:fill="EAF2FF"/>
-            <w:tcMar>
-              <w:top w:w="50" w:type="dxa"/>
-              <w:start w:w="120" w:type="dxa"/>
-              <w:bottom w:w="50" w:type="dxa"/>
-              <w:end w:w="120" w:type="dxa"/>
-            </w:tcMar>
-          </w:tcPr>
-          <w:p>
-            <w:pPr>
-              <w:spacing w:before="0" w:after="0" w:line="240" w:lineRule="auto"/>
-              <w:jc w:val="left"/>
-            </w:pPr>
-            <w:r>
-              <w:rPr>
-                <w:rFonts w:ascii="Arial" w:hAnsi="Arial"/>
-                <w:b w:val="0"/>
-                <w:i w:val="0"/>
-                <w:color w:val="182230"/>
-                <w:sz w:val="15"/>
-              </w:rPr>
-              <w:t>The system shall allow an authenticated passenger to view the current claim status and a chronological, multi-leg bag-scan timeline with airport, event, and timestamp for each scan.</w:t>
-            </w:r>
-          </w:p>
-        </w:tc>
-        <w:tc>
-          <w:tcPr>
-            <w:tcW w:type="dxa" w:w="800"/>
-            <w:vAlign w:val="center"/>
-            <w:shd w:fill="EAF2FF"/>
-            <w:tcMar>
-              <w:top w:w="50" w:type="dxa"/>
-              <w:start w:w="120" w:type="dxa"/>
-              <w:bottom w:w="50" w:type="dxa"/>
-              <w:end w:w="120" w:type="dxa"/>
-            </w:tcMar>
-          </w:tcPr>
-          <w:p>
-            <w:pPr>
-              <w:spacing w:before="0" w:after="0" w:line="240" w:lineRule="auto"/>
-              <w:jc w:val="center"/>
-            </w:pPr>
-            <w:r>
-              <w:rPr>
-                <w:rFonts w:ascii="Arial" w:hAnsi="Arial"/>
-                <w:b w:val="0"/>
-                <w:i w:val="0"/>
-                <w:color w:val="182230"/>
-                <w:sz w:val="15"/>
-              </w:rPr>
-              <w:t>High</w:t>
-            </w:r>
-          </w:p>
-        </w:tc>
-        <w:tc>
-          <w:tcPr>
-            <w:tcW w:type="dxa" w:w="4550"/>
-            <w:vAlign w:val="center"/>
-            <w:shd w:fill="EAF2FF"/>
-            <w:tcMar>
-              <w:top w:w="50" w:type="dxa"/>
-              <w:start w:w="120" w:type="dxa"/>
-              <w:bottom w:w="50" w:type="dxa"/>
-              <w:end w:w="120" w:type="dxa"/>
-            </w:tcMar>
-          </w:tcPr>
-          <w:p>
-            <w:pPr>
-              <w:spacing w:before="0" w:after="0" w:line="240" w:lineRule="auto"/>
-              <w:jc w:val="left"/>
-            </w:pPr>
-            <w:r>
-              <w:rPr>
-                <w:rFonts w:ascii="Arial" w:hAnsi="Arial"/>
-                <w:b w:val="0"/>
-                <w:i w:val="0"/>
-                <w:color w:val="182230"/>
-                <w:sz w:val="15"/>
-              </w:rPr>
-              <w:t>PASS: For a claim seeded with four scans, all four events appear in timestamp order and the displayed status matches the latest recorded claim state. FAIL: Any event is missing or out of order, the status is stale, or a passenger can open another passenger's claim by changing the URL.</w:t>
-            </w:r>
-          </w:p>
-        </w:tc>
-        <w:tc>
-          <w:tcPr>
-            <w:tcW w:type="dxa" w:w="3500"/>
-            <w:vAlign w:val="center"/>
-            <w:shd w:fill="EAF2FF"/>
-            <w:tcMar>
-              <w:top w:w="50" w:type="dxa"/>
-              <w:start w:w="120" w:type="dxa"/>
-              <w:bottom w:w="50" w:type="dxa"/>
-              <w:end w:w="120" w:type="dxa"/>
-            </w:tcMar>
-          </w:tcPr>
-          <w:p>
-            <w:pPr>
-              <w:spacing w:before="0" w:after="0" w:line="240" w:lineRule="auto"/>
-              <w:jc w:val="left"/>
-            </w:pPr>
-            <w:r>
-              <w:rPr>
-                <w:rFonts w:ascii="Arial" w:hAnsi="Arial"/>
-                <w:b w:val="0"/>
-                <w:i w:val="0"/>
-                <w:color w:val="182230"/>
-                <w:sz w:val="15"/>
-              </w:rPr>
-              <w:t>Gives passengers transparent self-service tracking while protecting claim data.</w:t>
-            </w:r>
-          </w:p>
-        </w:tc>
-      </w:tr>
-      <w:tr>
-        <w:trPr>
-          <w:cantSplit/>
-        </w:trPr>
-        <w:tc>
-          <w:tcPr>
-            <w:tcW w:type="dxa" w:w="1000"/>
+            <w:tcW w:type="dxa" w:w="1050"/>
             <w:vAlign w:val="center"/>
             <w:shd w:fill="FFFFFF"/>
             <w:tcMar>
@@ -855,16 +633,16 @@
                 <w:rFonts w:ascii="Arial" w:hAnsi="Arial"/>
                 <w:b/>
                 <w:i w:val="0"/>
-                <w:color w:val="17365D"/>
-                <w:sz w:val="15"/>
+                <w:color w:val="000000"/>
+                <w:sz w:val="16"/>
               </w:rPr>
-              <w:t>FR-004</w:t>
+              <w:t>FR-002</w:t>
             </w:r>
           </w:p>
         </w:tc>
         <w:tc>
           <w:tcPr>
-            <w:tcW w:type="dxa" w:w="1550"/>
+            <w:tcW w:type="dxa" w:w="1600"/>
             <w:vAlign w:val="center"/>
             <w:shd w:fill="FFFFFF"/>
             <w:tcMar>
@@ -884,8 +662,8 @@
                 <w:rFonts w:ascii="Arial" w:hAnsi="Arial"/>
                 <w:b w:val="0"/>
                 <w:i w:val="0"/>
-                <w:color w:val="182230"/>
-                <w:sz w:val="15"/>
+                <w:color w:val="000000"/>
+                <w:sz w:val="16"/>
               </w:rPr>
               <w:t>Functional</w:t>
             </w:r>
@@ -893,7 +671,7 @@
         </w:tc>
         <w:tc>
           <w:tcPr>
-            <w:tcW w:type="dxa" w:w="3000"/>
+            <w:tcW w:type="dxa" w:w="3150"/>
             <w:vAlign w:val="center"/>
             <w:shd w:fill="FFFFFF"/>
             <w:tcMar>
@@ -913,16 +691,16 @@
                 <w:rFonts w:ascii="Arial" w:hAnsi="Arial"/>
                 <w:b w:val="0"/>
                 <w:i w:val="0"/>
-                <w:color w:val="182230"/>
-                <w:sz w:val="15"/>
+                <w:color w:val="000000"/>
+                <w:sz w:val="16"/>
               </w:rPr>
-              <w:t>The system shall allow an authorized Baggage Service Agent to search assigned claims, add investigation notes, update claim status, associate a recovered bag, and record return-delivery details.</w:t>
+              <w:t>The system shall allow a passenger to submit a lost-luggage claim containing booking reference, bag-tag number, itinerary, contact details, bag description, delivery address, and optional supporting images.</w:t>
             </w:r>
           </w:p>
         </w:tc>
         <w:tc>
           <w:tcPr>
-            <w:tcW w:type="dxa" w:w="800"/>
+            <w:tcW w:type="dxa" w:w="850"/>
             <w:vAlign w:val="center"/>
             <w:shd w:fill="FFFFFF"/>
             <w:tcMar>
@@ -942,8 +720,8 @@
                 <w:rFonts w:ascii="Arial" w:hAnsi="Arial"/>
                 <w:b w:val="0"/>
                 <w:i w:val="0"/>
-                <w:color w:val="182230"/>
-                <w:sz w:val="15"/>
+                <w:color w:val="000000"/>
+                <w:sz w:val="16"/>
               </w:rPr>
               <w:t>High</w:t>
             </w:r>
@@ -951,7 +729,7 @@
         </w:tc>
         <w:tc>
           <w:tcPr>
-            <w:tcW w:type="dxa" w:w="4550"/>
+            <w:tcW w:type="dxa" w:w="4800"/>
             <w:vAlign w:val="center"/>
             <w:shd w:fill="FFFFFF"/>
             <w:tcMar>
@@ -971,16 +749,16 @@
                 <w:rFonts w:ascii="Arial" w:hAnsi="Arial"/>
                 <w:b w:val="0"/>
                 <w:i w:val="0"/>
-                <w:color w:val="182230"/>
-                <w:sz w:val="15"/>
+                <w:color w:val="000000"/>
+                <w:sz w:val="16"/>
               </w:rPr>
-              <w:t>PASS: An authorized agent can update a seeded claim to 'Located', record a delivery reference, and produce an audit entry containing agent ID and timestamp; the passenger view reflects the update within 5 seconds. FAIL: An unauthorized role can edit the claim, the audit entry is absent, or the passenger view remains stale.</w:t>
+              <w:t>PASS: With all mandatory valid fields, one claim with a unique claim ID is stored and a confirmation is displayed within 3 seconds. FAIL: A claim is created with a missing mandatory field, a duplicate claim is created for the same active passenger/bag pair, or no claim ID is returned.</w:t>
             </w:r>
           </w:p>
         </w:tc>
         <w:tc>
           <w:tcPr>
-            <w:tcW w:type="dxa" w:w="3500"/>
+            <w:tcW w:type="dxa" w:w="3670"/>
             <w:vAlign w:val="center"/>
             <w:shd w:fill="FFFFFF"/>
             <w:tcMar>
@@ -1000,10 +778,10 @@
                 <w:rFonts w:ascii="Arial" w:hAnsi="Arial"/>
                 <w:b w:val="0"/>
                 <w:i w:val="0"/>
-                <w:color w:val="182230"/>
-                <w:sz w:val="15"/>
+                <w:color w:val="000000"/>
+                <w:sz w:val="16"/>
               </w:rPr>
-              <w:t>Supports controlled investigation and traceable recovery operations by service staff.</w:t>
+              <w:t>Creates the authoritative case record needed for investigation, tracking, and passenger communication.</w:t>
             </w:r>
           </w:p>
         </w:tc>
@@ -1014,9 +792,9 @@
         </w:trPr>
         <w:tc>
           <w:tcPr>
-            <w:tcW w:type="dxa" w:w="1000"/>
+            <w:tcW w:type="dxa" w:w="1050"/>
             <w:vAlign w:val="center"/>
-            <w:shd w:fill="EAF2FF"/>
+            <w:shd w:fill="FFFFFF"/>
             <w:tcMar>
               <w:top w:w="50" w:type="dxa"/>
               <w:start w:w="120" w:type="dxa"/>
@@ -1034,18 +812,18 @@
                 <w:rFonts w:ascii="Arial" w:hAnsi="Arial"/>
                 <w:b/>
                 <w:i w:val="0"/>
-                <w:color w:val="17365D"/>
-                <w:sz w:val="15"/>
+                <w:color w:val="000000"/>
+                <w:sz w:val="16"/>
               </w:rPr>
-              <w:t>FR-005</w:t>
+              <w:t>FR-003</w:t>
             </w:r>
           </w:p>
         </w:tc>
         <w:tc>
           <w:tcPr>
-            <w:tcW w:type="dxa" w:w="1550"/>
+            <w:tcW w:type="dxa" w:w="1600"/>
             <w:vAlign w:val="center"/>
-            <w:shd w:fill="EAF2FF"/>
+            <w:shd w:fill="FFFFFF"/>
             <w:tcMar>
               <w:top w:w="50" w:type="dxa"/>
               <w:start w:w="120" w:type="dxa"/>
@@ -1063,8 +841,8 @@
                 <w:rFonts w:ascii="Arial" w:hAnsi="Arial"/>
                 <w:b w:val="0"/>
                 <w:i w:val="0"/>
-                <w:color w:val="182230"/>
-                <w:sz w:val="15"/>
+                <w:color w:val="000000"/>
+                <w:sz w:val="16"/>
               </w:rPr>
               <w:t>Functional</w:t>
             </w:r>
@@ -1072,9 +850,9 @@
         </w:tc>
         <w:tc>
           <w:tcPr>
-            <w:tcW w:type="dxa" w:w="3000"/>
+            <w:tcW w:type="dxa" w:w="3150"/>
             <w:vAlign w:val="center"/>
-            <w:shd w:fill="EAF2FF"/>
+            <w:shd w:fill="FFFFFF"/>
             <w:tcMar>
               <w:top w:w="50" w:type="dxa"/>
               <w:start w:w="120" w:type="dxa"/>
@@ -1092,18 +870,18 @@
                 <w:rFonts w:ascii="Arial" w:hAnsi="Arial"/>
                 <w:b w:val="0"/>
                 <w:i w:val="0"/>
-                <w:color w:val="182230"/>
-                <w:sz w:val="15"/>
+                <w:color w:val="000000"/>
+                <w:sz w:val="16"/>
               </w:rPr>
-              <w:t>The system shall initiate a compensation workflow when a claim meets configured delay or loss rules, calculate the policy-based amount, require agent approval, and submit the approved payment to the compensation service.</w:t>
+              <w:t>The system shall allow an authenticated passenger to view the current claim status and a chronological, multi-leg bag-scan timeline with airport, event, and timestamp for each scan.</w:t>
             </w:r>
           </w:p>
         </w:tc>
         <w:tc>
           <w:tcPr>
-            <w:tcW w:type="dxa" w:w="800"/>
+            <w:tcW w:type="dxa" w:w="850"/>
             <w:vAlign w:val="center"/>
-            <w:shd w:fill="EAF2FF"/>
+            <w:shd w:fill="FFFFFF"/>
             <w:tcMar>
               <w:top w:w="50" w:type="dxa"/>
               <w:start w:w="120" w:type="dxa"/>
@@ -1121,8 +899,8 @@
                 <w:rFonts w:ascii="Arial" w:hAnsi="Arial"/>
                 <w:b w:val="0"/>
                 <w:i w:val="0"/>
-                <w:color w:val="182230"/>
-                <w:sz w:val="15"/>
+                <w:color w:val="000000"/>
+                <w:sz w:val="16"/>
               </w:rPr>
               <w:t>High</w:t>
             </w:r>
@@ -1130,9 +908,9 @@
         </w:tc>
         <w:tc>
           <w:tcPr>
-            <w:tcW w:type="dxa" w:w="4550"/>
+            <w:tcW w:type="dxa" w:w="4800"/>
             <w:vAlign w:val="center"/>
-            <w:shd w:fill="EAF2FF"/>
+            <w:shd w:fill="FFFFFF"/>
             <w:tcMar>
               <w:top w:w="50" w:type="dxa"/>
               <w:start w:w="120" w:type="dxa"/>
@@ -1150,18 +928,18 @@
                 <w:rFonts w:ascii="Arial" w:hAnsi="Arial"/>
                 <w:b w:val="0"/>
                 <w:i w:val="0"/>
-                <w:color w:val="182230"/>
-                <w:sz w:val="15"/>
+                <w:color w:val="000000"/>
+                <w:sz w:val="16"/>
               </w:rPr>
-              <w:t>PASS: For an eligible seeded claim, the calculated amount exactly matches the configured policy, no payment request is sent before approval, and one approved transaction reference is stored. FAIL: An ineligible claim is paid, the amount differs from policy, payment precedes approval, or duplicate transactions are created.</w:t>
+              <w:t>PASS: For a claim seeded with four scans, all four events appear in timestamp order and the displayed status matches the latest recorded claim state. FAIL: Any event is missing or out of order, the status is stale, or a passenger can open another passenger's claim by changing the URL.</w:t>
             </w:r>
           </w:p>
         </w:tc>
         <w:tc>
           <w:tcPr>
-            <w:tcW w:type="dxa" w:w="3500"/>
+            <w:tcW w:type="dxa" w:w="3670"/>
             <w:vAlign w:val="center"/>
-            <w:shd w:fill="EAF2FF"/>
+            <w:shd w:fill="FFFFFF"/>
             <w:tcMar>
               <w:top w:w="50" w:type="dxa"/>
               <w:start w:w="120" w:type="dxa"/>
@@ -1179,10 +957,10 @@
                 <w:rFonts w:ascii="Arial" w:hAnsi="Arial"/>
                 <w:b w:val="0"/>
                 <w:i w:val="0"/>
-                <w:color w:val="182230"/>
-                <w:sz w:val="15"/>
+                <w:color w:val="000000"/>
+                <w:sz w:val="16"/>
               </w:rPr>
-              <w:t>Automates the compensation workflow named in the scenario while retaining human authorization.</w:t>
+              <w:t>Gives passengers transparent self-service tracking while protecting claim data.</w:t>
             </w:r>
           </w:p>
         </w:tc>
@@ -1193,9 +971,9 @@
         </w:trPr>
         <w:tc>
           <w:tcPr>
-            <w:tcW w:type="dxa" w:w="1000"/>
+            <w:tcW w:type="dxa" w:w="1050"/>
             <w:vAlign w:val="center"/>
-            <w:shd w:fill="F4FAF6"/>
+            <w:shd w:fill="FFFFFF"/>
             <w:tcMar>
               <w:top w:w="50" w:type="dxa"/>
               <w:start w:w="120" w:type="dxa"/>
@@ -1213,18 +991,18 @@
                 <w:rFonts w:ascii="Arial" w:hAnsi="Arial"/>
                 <w:b/>
                 <w:i w:val="0"/>
-                <w:color w:val="17365D"/>
-                <w:sz w:val="15"/>
+                <w:color w:val="000000"/>
+                <w:sz w:val="16"/>
               </w:rPr>
-              <w:t>NFR-001</w:t>
+              <w:t>FR-004</w:t>
             </w:r>
           </w:p>
         </w:tc>
         <w:tc>
           <w:tcPr>
-            <w:tcW w:type="dxa" w:w="1550"/>
+            <w:tcW w:type="dxa" w:w="1600"/>
             <w:vAlign w:val="center"/>
-            <w:shd w:fill="F4FAF6"/>
+            <w:shd w:fill="FFFFFF"/>
             <w:tcMar>
               <w:top w:w="50" w:type="dxa"/>
               <w:start w:w="120" w:type="dxa"/>
@@ -1242,20 +1020,18 @@
                 <w:rFonts w:ascii="Arial" w:hAnsi="Arial"/>
                 <w:b w:val="0"/>
                 <w:i w:val="0"/>
-                <w:color w:val="182230"/>
-                <w:sz w:val="15"/>
+                <w:color w:val="000000"/>
+                <w:sz w:val="16"/>
               </w:rPr>
-              <w:t>Nonfunctional</w:t>
-              <w:br/>
-              <w:t>Performance &amp; Security</w:t>
+              <w:t>Functional</w:t>
             </w:r>
           </w:p>
         </w:tc>
         <w:tc>
           <w:tcPr>
-            <w:tcW w:type="dxa" w:w="3000"/>
+            <w:tcW w:type="dxa" w:w="3150"/>
             <w:vAlign w:val="center"/>
-            <w:shd w:fill="F4FAF6"/>
+            <w:shd w:fill="FFFFFF"/>
             <w:tcMar>
               <w:top w:w="50" w:type="dxa"/>
               <w:start w:w="120" w:type="dxa"/>
@@ -1273,18 +1049,18 @@
                 <w:rFonts w:ascii="Arial" w:hAnsi="Arial"/>
                 <w:b w:val="0"/>
                 <w:i w:val="0"/>
-                <w:color w:val="182230"/>
-                <w:sz w:val="15"/>
+                <w:color w:val="000000"/>
+                <w:sz w:val="16"/>
               </w:rPr>
-              <w:t>The system shall return the complete multi-leg baggage scan timeline for an authorized request in under 200 ms and shall deny access to unauthorized requests.</w:t>
+              <w:t>The system shall allow an authorized Baggage Service Agent to search assigned claims, add investigation notes, update claim status, associate a recovered bag, and record return-delivery details.</w:t>
             </w:r>
           </w:p>
         </w:tc>
         <w:tc>
           <w:tcPr>
-            <w:tcW w:type="dxa" w:w="800"/>
+            <w:tcW w:type="dxa" w:w="850"/>
             <w:vAlign w:val="center"/>
-            <w:shd w:fill="F4FAF6"/>
+            <w:shd w:fill="FFFFFF"/>
             <w:tcMar>
               <w:top w:w="50" w:type="dxa"/>
               <w:start w:w="120" w:type="dxa"/>
@@ -1302,8 +1078,8 @@
                 <w:rFonts w:ascii="Arial" w:hAnsi="Arial"/>
                 <w:b w:val="0"/>
                 <w:i w:val="0"/>
-                <w:color w:val="182230"/>
-                <w:sz w:val="15"/>
+                <w:color w:val="000000"/>
+                <w:sz w:val="16"/>
               </w:rPr>
               <w:t>High</w:t>
             </w:r>
@@ -1311,9 +1087,9 @@
         </w:tc>
         <w:tc>
           <w:tcPr>
-            <w:tcW w:type="dxa" w:w="4550"/>
+            <w:tcW w:type="dxa" w:w="4800"/>
             <w:vAlign w:val="center"/>
-            <w:shd w:fill="F4FAF6"/>
+            <w:shd w:fill="FFFFFF"/>
             <w:tcMar>
               <w:top w:w="50" w:type="dxa"/>
               <w:start w:w="120" w:type="dxa"/>
@@ -1331,18 +1107,18 @@
                 <w:rFonts w:ascii="Arial" w:hAnsi="Arial"/>
                 <w:b w:val="0"/>
                 <w:i w:val="0"/>
-                <w:color w:val="182230"/>
-                <w:sz w:val="15"/>
+                <w:color w:val="000000"/>
+                <w:sz w:val="16"/>
               </w:rPr>
-              <w:t>PASS: In a 10,000-request peak-load test with 500 concurrent virtual users, the 95th-percentile authorized timeline response is at most 200 ms, and 100% of unauthorized requests return 401/403 without scan data. FAIL: Either threshold is missed.</w:t>
+              <w:t>PASS: An authorized agent can update a seeded claim to 'Located', record a delivery reference, and produce an audit entry containing agent ID and timestamp; the passenger view reflects the update within 5 seconds. FAIL: An unauthorized role can edit the claim, the audit entry is absent, or the passenger view remains stale.</w:t>
             </w:r>
           </w:p>
         </w:tc>
         <w:tc>
           <w:tcPr>
-            <w:tcW w:type="dxa" w:w="3500"/>
+            <w:tcW w:type="dxa" w:w="3670"/>
             <w:vAlign w:val="center"/>
-            <w:shd w:fill="F4FAF6"/>
+            <w:shd w:fill="FFFFFF"/>
             <w:tcMar>
               <w:top w:w="50" w:type="dxa"/>
               <w:start w:w="120" w:type="dxa"/>
@@ -1360,10 +1136,10 @@
                 <w:rFonts w:ascii="Arial" w:hAnsi="Arial"/>
                 <w:b w:val="0"/>
                 <w:i w:val="0"/>
-                <w:color w:val="182230"/>
-                <w:sz w:val="15"/>
+                <w:color w:val="000000"/>
+                <w:sz w:val="16"/>
               </w:rPr>
-              <w:t>Preserves the supplied NFR-001 latency target and makes its security expectation measurable.</w:t>
+              <w:t>Supports controlled investigation and traceable recovery operations by service staff.</w:t>
             </w:r>
           </w:p>
         </w:tc>
@@ -1374,9 +1150,9 @@
         </w:trPr>
         <w:tc>
           <w:tcPr>
-            <w:tcW w:type="dxa" w:w="1000"/>
+            <w:tcW w:type="dxa" w:w="1050"/>
             <w:vAlign w:val="center"/>
-            <w:shd w:fill="EAF6EF"/>
+            <w:shd w:fill="FFFFFF"/>
             <w:tcMar>
               <w:top w:w="50" w:type="dxa"/>
               <w:start w:w="120" w:type="dxa"/>
@@ -1394,18 +1170,18 @@
                 <w:rFonts w:ascii="Arial" w:hAnsi="Arial"/>
                 <w:b/>
                 <w:i w:val="0"/>
-                <w:color w:val="17365D"/>
-                <w:sz w:val="15"/>
+                <w:color w:val="000000"/>
+                <w:sz w:val="16"/>
               </w:rPr>
-              <w:t>NFR-002</w:t>
+              <w:t>FR-005</w:t>
             </w:r>
           </w:p>
         </w:tc>
         <w:tc>
           <w:tcPr>
-            <w:tcW w:type="dxa" w:w="1550"/>
+            <w:tcW w:type="dxa" w:w="1600"/>
             <w:vAlign w:val="center"/>
-            <w:shd w:fill="EAF6EF"/>
+            <w:shd w:fill="FFFFFF"/>
             <w:tcMar>
               <w:top w:w="50" w:type="dxa"/>
               <w:start w:w="120" w:type="dxa"/>
@@ -1423,20 +1199,18 @@
                 <w:rFonts w:ascii="Arial" w:hAnsi="Arial"/>
                 <w:b w:val="0"/>
                 <w:i w:val="0"/>
-                <w:color w:val="182230"/>
-                <w:sz w:val="15"/>
+                <w:color w:val="000000"/>
+                <w:sz w:val="16"/>
               </w:rPr>
-              <w:t>Nonfunctional</w:t>
-              <w:br/>
-              <w:t>Availability &amp; Recoverability</w:t>
+              <w:t>Functional</w:t>
             </w:r>
           </w:p>
         </w:tc>
         <w:tc>
           <w:tcPr>
-            <w:tcW w:type="dxa" w:w="3000"/>
+            <w:tcW w:type="dxa" w:w="3150"/>
             <w:vAlign w:val="center"/>
-            <w:shd w:fill="EAF6EF"/>
+            <w:shd w:fill="FFFFFF"/>
             <w:tcMar>
               <w:top w:w="50" w:type="dxa"/>
               <w:start w:w="120" w:type="dxa"/>
@@ -1454,18 +1228,18 @@
                 <w:rFonts w:ascii="Arial" w:hAnsi="Arial"/>
                 <w:b w:val="0"/>
                 <w:i w:val="0"/>
-                <w:color w:val="182230"/>
-                <w:sz w:val="15"/>
+                <w:color w:val="000000"/>
+                <w:sz w:val="16"/>
               </w:rPr>
-              <w:t>The system shall provide at least 99.9% monthly availability, excluding announced maintenance, and shall recover from a single-service failure within 15 minutes with no more than 5 minutes of committed claim-data loss.</w:t>
+              <w:t>The system shall initiate a compensation workflow when a claim meets configured delay or loss rules, calculate the policy-based amount, require agent approval, and submit the approved payment to the compensation service.</w:t>
             </w:r>
           </w:p>
         </w:tc>
         <w:tc>
           <w:tcPr>
-            <w:tcW w:type="dxa" w:w="800"/>
+            <w:tcW w:type="dxa" w:w="850"/>
             <w:vAlign w:val="center"/>
-            <w:shd w:fill="EAF6EF"/>
+            <w:shd w:fill="FFFFFF"/>
             <w:tcMar>
               <w:top w:w="50" w:type="dxa"/>
               <w:start w:w="120" w:type="dxa"/>
@@ -1483,8 +1257,8 @@
                 <w:rFonts w:ascii="Arial" w:hAnsi="Arial"/>
                 <w:b w:val="0"/>
                 <w:i w:val="0"/>
-                <w:color w:val="182230"/>
-                <w:sz w:val="15"/>
+                <w:color w:val="000000"/>
+                <w:sz w:val="16"/>
               </w:rPr>
               <w:t>High</w:t>
             </w:r>
@@ -1492,9 +1266,9 @@
         </w:tc>
         <w:tc>
           <w:tcPr>
-            <w:tcW w:type="dxa" w:w="4550"/>
+            <w:tcW w:type="dxa" w:w="4800"/>
             <w:vAlign w:val="center"/>
-            <w:shd w:fill="EAF6EF"/>
+            <w:shd w:fill="FFFFFF"/>
             <w:tcMar>
               <w:top w:w="50" w:type="dxa"/>
               <w:start w:w="120" w:type="dxa"/>
@@ -1512,18 +1286,18 @@
                 <w:rFonts w:ascii="Arial" w:hAnsi="Arial"/>
                 <w:b w:val="0"/>
                 <w:i w:val="0"/>
-                <w:color w:val="182230"/>
-                <w:sz w:val="15"/>
+                <w:color w:val="000000"/>
+                <w:sz w:val="16"/>
               </w:rPr>
-              <w:t>PASS: Monthly monitoring reports availability of at least 99.9%, and a controlled failover test demonstrates recovery time of at most 15 minutes and recovery point of at most 5 minutes. FAIL: Availability, recovery time, or recovery point exceeds its limit.</w:t>
+              <w:t>PASS: For an eligible seeded claim, the calculated amount exactly matches the configured policy, no payment request is sent before approval, and one approved transaction reference is stored. FAIL: An ineligible claim is paid, the amount differs from policy, payment precedes approval, or duplicate transactions are created.</w:t>
             </w:r>
           </w:p>
         </w:tc>
         <w:tc>
           <w:tcPr>
-            <w:tcW w:type="dxa" w:w="3500"/>
+            <w:tcW w:type="dxa" w:w="3670"/>
             <w:vAlign w:val="center"/>
-            <w:shd w:fill="EAF6EF"/>
+            <w:shd w:fill="FFFFFF"/>
             <w:tcMar>
               <w:top w:w="50" w:type="dxa"/>
               <w:start w:w="120" w:type="dxa"/>
@@ -1541,8 +1315,370 @@
                 <w:rFonts w:ascii="Arial" w:hAnsi="Arial"/>
                 <w:b w:val="0"/>
                 <w:i w:val="0"/>
-                <w:color w:val="182230"/>
+                <w:color w:val="000000"/>
+                <w:sz w:val="16"/>
+              </w:rPr>
+              <w:t>Automates the compensation workflow named in the scenario while retaining human authorization.</w:t>
+            </w:r>
+          </w:p>
+        </w:tc>
+      </w:tr>
+      <w:tr>
+        <w:trPr>
+          <w:cantSplit/>
+        </w:trPr>
+        <w:tc>
+          <w:tcPr>
+            <w:tcW w:type="dxa" w:w="1050"/>
+            <w:vAlign w:val="center"/>
+            <w:shd w:fill="FFFFFF"/>
+            <w:tcMar>
+              <w:top w:w="50" w:type="dxa"/>
+              <w:start w:w="120" w:type="dxa"/>
+              <w:bottom w:w="50" w:type="dxa"/>
+              <w:end w:w="120" w:type="dxa"/>
+            </w:tcMar>
+          </w:tcPr>
+          <w:p>
+            <w:pPr>
+              <w:spacing w:before="0" w:after="0" w:line="240" w:lineRule="auto"/>
+              <w:jc w:val="center"/>
+            </w:pPr>
+            <w:r>
+              <w:rPr>
+                <w:rFonts w:ascii="Arial" w:hAnsi="Arial"/>
+                <w:b/>
+                <w:i w:val="0"/>
+                <w:color w:val="000000"/>
+                <w:sz w:val="16"/>
+              </w:rPr>
+              <w:t>NFR-001</w:t>
+            </w:r>
+          </w:p>
+        </w:tc>
+        <w:tc>
+          <w:tcPr>
+            <w:tcW w:type="dxa" w:w="1600"/>
+            <w:vAlign w:val="center"/>
+            <w:shd w:fill="FFFFFF"/>
+            <w:tcMar>
+              <w:top w:w="50" w:type="dxa"/>
+              <w:start w:w="120" w:type="dxa"/>
+              <w:bottom w:w="50" w:type="dxa"/>
+              <w:end w:w="120" w:type="dxa"/>
+            </w:tcMar>
+          </w:tcPr>
+          <w:p>
+            <w:pPr>
+              <w:spacing w:before="0" w:after="0" w:line="240" w:lineRule="auto"/>
+              <w:jc w:val="center"/>
+            </w:pPr>
+            <w:r>
+              <w:rPr>
+                <w:rFonts w:ascii="Arial" w:hAnsi="Arial"/>
+                <w:b w:val="0"/>
+                <w:i w:val="0"/>
+                <w:color w:val="000000"/>
                 <w:sz w:val="15"/>
+              </w:rPr>
+              <w:t>Nonfunctional</w:t>
+              <w:br/>
+              <w:t>Performance &amp; Security</w:t>
+            </w:r>
+          </w:p>
+        </w:tc>
+        <w:tc>
+          <w:tcPr>
+            <w:tcW w:type="dxa" w:w="3150"/>
+            <w:vAlign w:val="center"/>
+            <w:shd w:fill="FFFFFF"/>
+            <w:tcMar>
+              <w:top w:w="50" w:type="dxa"/>
+              <w:start w:w="120" w:type="dxa"/>
+              <w:bottom w:w="50" w:type="dxa"/>
+              <w:end w:w="120" w:type="dxa"/>
+            </w:tcMar>
+          </w:tcPr>
+          <w:p>
+            <w:pPr>
+              <w:spacing w:before="0" w:after="0" w:line="240" w:lineRule="auto"/>
+              <w:jc w:val="left"/>
+            </w:pPr>
+            <w:r>
+              <w:rPr>
+                <w:rFonts w:ascii="Arial" w:hAnsi="Arial"/>
+                <w:b w:val="0"/>
+                <w:i w:val="0"/>
+                <w:color w:val="000000"/>
+                <w:sz w:val="16"/>
+              </w:rPr>
+              <w:t>The system shall return the complete multi-leg baggage scan timeline for an authorized request in under 200 ms and shall deny access to unauthorized requests.</w:t>
+            </w:r>
+          </w:p>
+        </w:tc>
+        <w:tc>
+          <w:tcPr>
+            <w:tcW w:type="dxa" w:w="850"/>
+            <w:vAlign w:val="center"/>
+            <w:shd w:fill="FFFFFF"/>
+            <w:tcMar>
+              <w:top w:w="50" w:type="dxa"/>
+              <w:start w:w="120" w:type="dxa"/>
+              <w:bottom w:w="50" w:type="dxa"/>
+              <w:end w:w="120" w:type="dxa"/>
+            </w:tcMar>
+          </w:tcPr>
+          <w:p>
+            <w:pPr>
+              <w:spacing w:before="0" w:after="0" w:line="240" w:lineRule="auto"/>
+              <w:jc w:val="center"/>
+            </w:pPr>
+            <w:r>
+              <w:rPr>
+                <w:rFonts w:ascii="Arial" w:hAnsi="Arial"/>
+                <w:b w:val="0"/>
+                <w:i w:val="0"/>
+                <w:color w:val="000000"/>
+                <w:sz w:val="16"/>
+              </w:rPr>
+              <w:t>High</w:t>
+            </w:r>
+          </w:p>
+        </w:tc>
+        <w:tc>
+          <w:tcPr>
+            <w:tcW w:type="dxa" w:w="4800"/>
+            <w:vAlign w:val="center"/>
+            <w:shd w:fill="FFFFFF"/>
+            <w:tcMar>
+              <w:top w:w="50" w:type="dxa"/>
+              <w:start w:w="120" w:type="dxa"/>
+              <w:bottom w:w="50" w:type="dxa"/>
+              <w:end w:w="120" w:type="dxa"/>
+            </w:tcMar>
+          </w:tcPr>
+          <w:p>
+            <w:pPr>
+              <w:spacing w:before="0" w:after="0" w:line="240" w:lineRule="auto"/>
+              <w:jc w:val="left"/>
+            </w:pPr>
+            <w:r>
+              <w:rPr>
+                <w:rFonts w:ascii="Arial" w:hAnsi="Arial"/>
+                <w:b w:val="0"/>
+                <w:i w:val="0"/>
+                <w:color w:val="000000"/>
+                <w:sz w:val="16"/>
+              </w:rPr>
+              <w:t>PASS: In a 10,000-request peak-load test with 500 concurrent virtual users, the 95th-percentile authorized timeline response is at most 200 ms, and 100% of unauthorized requests return 401/403 without scan data. FAIL: Either threshold is missed.</w:t>
+            </w:r>
+          </w:p>
+        </w:tc>
+        <w:tc>
+          <w:tcPr>
+            <w:tcW w:type="dxa" w:w="3670"/>
+            <w:vAlign w:val="center"/>
+            <w:shd w:fill="FFFFFF"/>
+            <w:tcMar>
+              <w:top w:w="50" w:type="dxa"/>
+              <w:start w:w="120" w:type="dxa"/>
+              <w:bottom w:w="50" w:type="dxa"/>
+              <w:end w:w="120" w:type="dxa"/>
+            </w:tcMar>
+          </w:tcPr>
+          <w:p>
+            <w:pPr>
+              <w:spacing w:before="0" w:after="0" w:line="240" w:lineRule="auto"/>
+              <w:jc w:val="left"/>
+            </w:pPr>
+            <w:r>
+              <w:rPr>
+                <w:rFonts w:ascii="Arial" w:hAnsi="Arial"/>
+                <w:b w:val="0"/>
+                <w:i w:val="0"/>
+                <w:color w:val="000000"/>
+                <w:sz w:val="16"/>
+              </w:rPr>
+              <w:t>Preserves the supplied NFR-001 latency target and makes its security expectation measurable.</w:t>
+            </w:r>
+          </w:p>
+        </w:tc>
+      </w:tr>
+      <w:tr>
+        <w:trPr>
+          <w:cantSplit/>
+        </w:trPr>
+        <w:tc>
+          <w:tcPr>
+            <w:tcW w:type="dxa" w:w="1050"/>
+            <w:vAlign w:val="center"/>
+            <w:shd w:fill="FFFFFF"/>
+            <w:tcMar>
+              <w:top w:w="50" w:type="dxa"/>
+              <w:start w:w="120" w:type="dxa"/>
+              <w:bottom w:w="50" w:type="dxa"/>
+              <w:end w:w="120" w:type="dxa"/>
+            </w:tcMar>
+          </w:tcPr>
+          <w:p>
+            <w:pPr>
+              <w:spacing w:before="0" w:after="0" w:line="240" w:lineRule="auto"/>
+              <w:jc w:val="center"/>
+            </w:pPr>
+            <w:r>
+              <w:rPr>
+                <w:rFonts w:ascii="Arial" w:hAnsi="Arial"/>
+                <w:b/>
+                <w:i w:val="0"/>
+                <w:color w:val="000000"/>
+                <w:sz w:val="16"/>
+              </w:rPr>
+              <w:t>NFR-002</w:t>
+            </w:r>
+          </w:p>
+        </w:tc>
+        <w:tc>
+          <w:tcPr>
+            <w:tcW w:type="dxa" w:w="1600"/>
+            <w:vAlign w:val="center"/>
+            <w:shd w:fill="FFFFFF"/>
+            <w:tcMar>
+              <w:top w:w="50" w:type="dxa"/>
+              <w:start w:w="120" w:type="dxa"/>
+              <w:bottom w:w="50" w:type="dxa"/>
+              <w:end w:w="120" w:type="dxa"/>
+            </w:tcMar>
+          </w:tcPr>
+          <w:p>
+            <w:pPr>
+              <w:spacing w:before="0" w:after="0" w:line="240" w:lineRule="auto"/>
+              <w:jc w:val="center"/>
+            </w:pPr>
+            <w:r>
+              <w:rPr>
+                <w:rFonts w:ascii="Arial" w:hAnsi="Arial"/>
+                <w:b w:val="0"/>
+                <w:i w:val="0"/>
+                <w:color w:val="000000"/>
+                <w:sz w:val="15"/>
+              </w:rPr>
+              <w:t>Nonfunctional</w:t>
+              <w:br/>
+              <w:t>Availability &amp; Recoverability</w:t>
+            </w:r>
+          </w:p>
+        </w:tc>
+        <w:tc>
+          <w:tcPr>
+            <w:tcW w:type="dxa" w:w="3150"/>
+            <w:vAlign w:val="center"/>
+            <w:shd w:fill="FFFFFF"/>
+            <w:tcMar>
+              <w:top w:w="50" w:type="dxa"/>
+              <w:start w:w="120" w:type="dxa"/>
+              <w:bottom w:w="50" w:type="dxa"/>
+              <w:end w:w="120" w:type="dxa"/>
+            </w:tcMar>
+          </w:tcPr>
+          <w:p>
+            <w:pPr>
+              <w:spacing w:before="0" w:after="0" w:line="240" w:lineRule="auto"/>
+              <w:jc w:val="left"/>
+            </w:pPr>
+            <w:r>
+              <w:rPr>
+                <w:rFonts w:ascii="Arial" w:hAnsi="Arial"/>
+                <w:b w:val="0"/>
+                <w:i w:val="0"/>
+                <w:color w:val="000000"/>
+                <w:sz w:val="16"/>
+              </w:rPr>
+              <w:t>The system shall provide at least 99.9% monthly availability, excluding announced maintenance, and shall recover from a single-service failure within 15 minutes with no more than 5 minutes of committed claim-data loss.</w:t>
+            </w:r>
+          </w:p>
+        </w:tc>
+        <w:tc>
+          <w:tcPr>
+            <w:tcW w:type="dxa" w:w="850"/>
+            <w:vAlign w:val="center"/>
+            <w:shd w:fill="FFFFFF"/>
+            <w:tcMar>
+              <w:top w:w="50" w:type="dxa"/>
+              <w:start w:w="120" w:type="dxa"/>
+              <w:bottom w:w="50" w:type="dxa"/>
+              <w:end w:w="120" w:type="dxa"/>
+            </w:tcMar>
+          </w:tcPr>
+          <w:p>
+            <w:pPr>
+              <w:spacing w:before="0" w:after="0" w:line="240" w:lineRule="auto"/>
+              <w:jc w:val="center"/>
+            </w:pPr>
+            <w:r>
+              <w:rPr>
+                <w:rFonts w:ascii="Arial" w:hAnsi="Arial"/>
+                <w:b w:val="0"/>
+                <w:i w:val="0"/>
+                <w:color w:val="000000"/>
+                <w:sz w:val="16"/>
+              </w:rPr>
+              <w:t>High</w:t>
+            </w:r>
+          </w:p>
+        </w:tc>
+        <w:tc>
+          <w:tcPr>
+            <w:tcW w:type="dxa" w:w="4800"/>
+            <w:vAlign w:val="center"/>
+            <w:shd w:fill="FFFFFF"/>
+            <w:tcMar>
+              <w:top w:w="50" w:type="dxa"/>
+              <w:start w:w="120" w:type="dxa"/>
+              <w:bottom w:w="50" w:type="dxa"/>
+              <w:end w:w="120" w:type="dxa"/>
+            </w:tcMar>
+          </w:tcPr>
+          <w:p>
+            <w:pPr>
+              <w:spacing w:before="0" w:after="0" w:line="240" w:lineRule="auto"/>
+              <w:jc w:val="left"/>
+            </w:pPr>
+            <w:r>
+              <w:rPr>
+                <w:rFonts w:ascii="Arial" w:hAnsi="Arial"/>
+                <w:b w:val="0"/>
+                <w:i w:val="0"/>
+                <w:color w:val="000000"/>
+                <w:sz w:val="16"/>
+              </w:rPr>
+              <w:t>PASS: Monthly monitoring reports availability of at least 99.9%, and a controlled failover test demonstrates recovery time of at most 15 minutes and recovery point of at most 5 minutes. FAIL: Availability, recovery time, or recovery point exceeds its limit.</w:t>
+            </w:r>
+          </w:p>
+        </w:tc>
+        <w:tc>
+          <w:tcPr>
+            <w:tcW w:type="dxa" w:w="3670"/>
+            <w:vAlign w:val="center"/>
+            <w:shd w:fill="FFFFFF"/>
+            <w:tcMar>
+              <w:top w:w="50" w:type="dxa"/>
+              <w:start w:w="120" w:type="dxa"/>
+              <w:bottom w:w="50" w:type="dxa"/>
+              <w:end w:w="120" w:type="dxa"/>
+            </w:tcMar>
+          </w:tcPr>
+          <w:p>
+            <w:pPr>
+              <w:spacing w:before="0" w:after="0" w:line="240" w:lineRule="auto"/>
+              <w:jc w:val="left"/>
+            </w:pPr>
+            <w:r>
+              <w:rPr>
+                <w:rFonts w:ascii="Arial" w:hAnsi="Arial"/>
+                <w:b w:val="0"/>
+                <w:i w:val="0"/>
+                <w:color w:val="000000"/>
+                <w:sz w:val="16"/>
               </w:rPr>
               <w:t>Passengers and agents need dependable access during irregular baggage operations, without losing active claim records.</w:t>
             </w:r>
@@ -1550,36 +1686,10 @@
         </w:tc>
       </w:tr>
     </w:tbl>
-    <w:p>
-      <w:pPr>
-        <w:keepNext w:val="0"/>
-        <w:spacing w:before="100" w:after="0"/>
-      </w:pPr>
-      <w:r>
-        <w:rPr>
-          <w:rFonts w:ascii="Arial" w:hAnsi="Arial"/>
-          <w:b/>
-          <w:i w:val="0"/>
-          <w:color w:val="2F66D0"/>
-          <w:sz w:val="16"/>
-        </w:rPr>
-        <w:t xml:space="preserve">Quality check: </w:t>
-      </w:r>
-      <w:r>
-        <w:rPr>
-          <w:rFonts w:ascii="Arial" w:hAnsi="Arial"/>
-          <w:b w:val="0"/>
-          <w:i w:val="0"/>
-          <w:color w:val="5B6573"/>
-          <w:sz w:val="16"/>
-        </w:rPr>
-        <w:t>Exactly 5 FRs and 2 NFRs; every description uses 'shall'; each acceptance criterion defines explicit PASS and FAIL conditions.</w:t>
-      </w:r>
-    </w:p>
     <w:sectPr>
       <w:footerReference w:type="default" r:id="rId9"/>
-      <w:pgSz w:w="15840" w:h="12240" w:orient="landscape"/>
-      <w:pgMar w:top="504" w:right="720" w:bottom="504" w:left="720" w:header="360" w:footer="360" w:gutter="0"/>
+      <w:pgSz w:w="16834" w:h="11909" w:orient="landscape"/>
+      <w:pgMar w:top="605" w:right="857" w:bottom="605" w:left="857" w:header="288" w:footer="288" w:gutter="0"/>
       <w:cols w:space="720"/>
       <w:docGrid w:linePitch="360"/>
     </w:sectPr>
@@ -1596,14 +1706,15 @@
   </w:p>
   <w:tbl>
     <w:tblPr>
-      <w:tblW w:type="auto" w:w="0"/>
-      <w:jc w:val="center"/>
+      <w:tblW w:type="dxa" w:w="15120"/>
       <w:tblLayout w:type="fixed"/>
       <w:tblLook w:firstColumn="1" w:firstRow="1" w:lastColumn="0" w:lastRow="0" w:noHBand="0" w:noVBand="1" w:val="04A0"/>
+      <w:jc w:val="center"/>
+      <w:tblInd w:w="0" w:type="dxa"/>
     </w:tblPr>
     <w:tblGrid>
-      <w:gridCol w:w="7488"/>
-      <w:gridCol w:w="1872"/>
+      <w:gridCol w:w="13720"/>
+      <w:gridCol w:w="1400"/>
     </w:tblGrid>
     <w:tr>
       <w:trPr>
@@ -1611,14 +1722,16 @@
       </w:trPr>
       <w:tc>
         <w:tcPr>
-          <w:tcW w:type="dxa" w:w="4680"/>
-          <w:tcBorders/>
+          <w:tcW w:type="dxa" w:w="13720"/>
           <w:tcMar>
-            <w:top w:w="0" w:type="dxa"/>
+            <w:top w:w="55" w:type="dxa"/>
             <w:start w:w="0" w:type="dxa"/>
             <w:bottom w:w="0" w:type="dxa"/>
             <w:end w:w="0" w:type="dxa"/>
           </w:tcMar>
+          <w:tcBorders>
+            <w:top w:val="single" w:sz="4" w:space="0" w:color="777777"/>
+          </w:tcBorders>
         </w:tcPr>
         <w:p>
           <w:pPr>
@@ -1629,23 +1742,25 @@
               <w:rFonts w:ascii="Arial" w:hAnsi="Arial"/>
               <w:b w:val="0"/>
               <w:i w:val="0"/>
-              <w:color w:val="5B6573"/>
+              <w:color w:val="000000"/>
               <w:sz w:val="16"/>
             </w:rPr>
-            <w:t>PES1UG24CS579 | Airport Lost Luggage Claim &amp; Tracking Portal</w:t>
+            <w:t>PES1UG24CS579</w:t>
           </w:r>
         </w:p>
       </w:tc>
       <w:tc>
         <w:tcPr>
-          <w:tcW w:type="dxa" w:w="4680"/>
-          <w:tcBorders/>
+          <w:tcW w:type="dxa" w:w="1400"/>
           <w:tcMar>
-            <w:top w:w="0" w:type="dxa"/>
+            <w:top w:w="55" w:type="dxa"/>
             <w:start w:w="0" w:type="dxa"/>
             <w:bottom w:w="0" w:type="dxa"/>
             <w:end w:w="0" w:type="dxa"/>
           </w:tcMar>
+          <w:tcBorders>
+            <w:top w:val="single" w:sz="4" w:space="0" w:color="777777"/>
+          </w:tcBorders>
         </w:tcPr>
         <w:p>
           <w:pPr>
@@ -1657,7 +1772,7 @@
               <w:rFonts w:ascii="Arial" w:hAnsi="Arial"/>
               <w:b w:val="0"/>
               <w:i w:val="0"/>
-              <w:color w:val="5B6573"/>
+              <w:color w:val="000000"/>
               <w:sz w:val="16"/>
             </w:rPr>
             <w:t xml:space="preserve">Page </w:t>
@@ -2038,7 +2153,7 @@
     </w:pPr>
     <w:rPr>
       <w:rFonts w:ascii="Arial" w:hAnsi="Arial"/>
-      <w:color w:val="182230"/>
+      <w:color w:val="000000"/>
       <w:sz w:val="19"/>
     </w:rPr>
   </w:style>
@@ -2104,7 +2219,7 @@
       <w:rFonts w:asciiTheme="majorHAnsi" w:eastAsiaTheme="majorEastAsia" w:hAnsiTheme="majorHAnsi" w:cstheme="majorBidi" w:ascii="Arial" w:hAnsi="Arial"/>
       <w:b/>
       <w:bCs/>
-      <w:color w:val="17365D"/>
+      <w:color w:val="000000"/>
       <w:sz w:val="28"/>
       <w:szCs w:val="28"/>
     </w:rPr>
@@ -2128,7 +2243,7 @@
       <w:rFonts w:asciiTheme="majorHAnsi" w:eastAsiaTheme="majorEastAsia" w:hAnsiTheme="majorHAnsi" w:cstheme="majorBidi" w:ascii="Arial" w:hAnsi="Arial"/>
       <w:b/>
       <w:bCs/>
-      <w:color w:val="17365D"/>
+      <w:color w:val="000000"/>
       <w:sz w:val="23"/>
       <w:szCs w:val="26"/>
     </w:rPr>
@@ -2152,7 +2267,7 @@
       <w:rFonts w:asciiTheme="majorHAnsi" w:eastAsiaTheme="majorEastAsia" w:hAnsiTheme="majorHAnsi" w:cstheme="majorBidi" w:ascii="Arial" w:hAnsi="Arial"/>
       <w:b/>
       <w:bCs/>
-      <w:color w:val="17365D"/>
+      <w:color w:val="000000"/>
       <w:sz w:val="21"/>
     </w:rPr>
   </w:style>

</xml_diff>